<commit_message>
Update clients/altai_lavash/KP_ALTAI_LAVASH.docx - corrected savings
</commit_message>
<xml_diff>
--- a/clients/altai_lavash/KP_ALTAI_LAVASH.docx
+++ b/clients/altai_lavash/KP_ALTAI_LAVASH.docx
@@ -109,7 +109,7 @@
       <w:tr>
         <w:tc>
           <w:tcPr>
-            <w:tcW w:type="dxa" w:w="3168"/>
+            <w:tcW w:type="dxa" w:w="4320"/>
           </w:tcPr>
           <w:p>
             <w:r>
@@ -123,7 +123,7 @@
         </w:tc>
         <w:tc>
           <w:tcPr>
-            <w:tcW w:type="dxa" w:w="5760"/>
+            <w:tcW w:type="dxa" w:w="4320"/>
           </w:tcPr>
           <w:p>
             <w:r>
@@ -138,7 +138,7 @@
       <w:tr>
         <w:tc>
           <w:tcPr>
-            <w:tcW w:type="dxa" w:w="3168"/>
+            <w:tcW w:type="dxa" w:w="4320"/>
             <w:shd w:val="clear" w:color="auto" w:fill="F5F5F5"/>
           </w:tcPr>
           <w:p>
@@ -153,7 +153,7 @@
         </w:tc>
         <w:tc>
           <w:tcPr>
-            <w:tcW w:type="dxa" w:w="5760"/>
+            <w:tcW w:type="dxa" w:w="4320"/>
             <w:shd w:val="clear" w:color="auto" w:fill="F5F5F5"/>
           </w:tcPr>
           <w:p>
@@ -169,7 +169,7 @@
       <w:tr>
         <w:tc>
           <w:tcPr>
-            <w:tcW w:type="dxa" w:w="3168"/>
+            <w:tcW w:type="dxa" w:w="4320"/>
           </w:tcPr>
           <w:p>
             <w:r>
@@ -183,7 +183,7 @@
         </w:tc>
         <w:tc>
           <w:tcPr>
-            <w:tcW w:type="dxa" w:w="5760"/>
+            <w:tcW w:type="dxa" w:w="4320"/>
           </w:tcPr>
           <w:p>
             <w:r>
@@ -198,7 +198,7 @@
       <w:tr>
         <w:tc>
           <w:tcPr>
-            <w:tcW w:type="dxa" w:w="3168"/>
+            <w:tcW w:type="dxa" w:w="4320"/>
             <w:shd w:val="clear" w:color="auto" w:fill="F5F5F5"/>
           </w:tcPr>
           <w:p>
@@ -213,7 +213,7 @@
         </w:tc>
         <w:tc>
           <w:tcPr>
-            <w:tcW w:type="dxa" w:w="5760"/>
+            <w:tcW w:type="dxa" w:w="4320"/>
             <w:shd w:val="clear" w:color="auto" w:fill="F5F5F5"/>
           </w:tcPr>
           <w:p>
@@ -229,7 +229,7 @@
       <w:tr>
         <w:tc>
           <w:tcPr>
-            <w:tcW w:type="dxa" w:w="3168"/>
+            <w:tcW w:type="dxa" w:w="4320"/>
           </w:tcPr>
           <w:p>
             <w:r>
@@ -243,7 +243,7 @@
         </w:tc>
         <w:tc>
           <w:tcPr>
-            <w:tcW w:type="dxa" w:w="5760"/>
+            <w:tcW w:type="dxa" w:w="4320"/>
           </w:tcPr>
           <w:p>
             <w:r>
@@ -258,7 +258,7 @@
       <w:tr>
         <w:tc>
           <w:tcPr>
-            <w:tcW w:type="dxa" w:w="3168"/>
+            <w:tcW w:type="dxa" w:w="4320"/>
             <w:shd w:val="clear" w:color="auto" w:fill="F5F5F5"/>
           </w:tcPr>
           <w:p>
@@ -273,7 +273,7 @@
         </w:tc>
         <w:tc>
           <w:tcPr>
-            <w:tcW w:type="dxa" w:w="5760"/>
+            <w:tcW w:type="dxa" w:w="4320"/>
             <w:shd w:val="clear" w:color="auto" w:fill="F5F5F5"/>
           </w:tcPr>
           <w:p>
@@ -289,7 +289,7 @@
       <w:tr>
         <w:tc>
           <w:tcPr>
-            <w:tcW w:type="dxa" w:w="3168"/>
+            <w:tcW w:type="dxa" w:w="4320"/>
           </w:tcPr>
           <w:p>
             <w:r>
@@ -303,7 +303,7 @@
         </w:tc>
         <w:tc>
           <w:tcPr>
-            <w:tcW w:type="dxa" w:w="5760"/>
+            <w:tcW w:type="dxa" w:w="4320"/>
           </w:tcPr>
           <w:p>
             <w:r>
@@ -318,7 +318,7 @@
       <w:tr>
         <w:tc>
           <w:tcPr>
-            <w:tcW w:type="dxa" w:w="3168"/>
+            <w:tcW w:type="dxa" w:w="4320"/>
             <w:shd w:val="clear" w:color="auto" w:fill="F5F5F5"/>
           </w:tcPr>
           <w:p>
@@ -333,7 +333,7 @@
         </w:tc>
         <w:tc>
           <w:tcPr>
-            <w:tcW w:type="dxa" w:w="5760"/>
+            <w:tcW w:type="dxa" w:w="4320"/>
             <w:shd w:val="clear" w:color="auto" w:fill="F5F5F5"/>
           </w:tcPr>
           <w:p>
@@ -408,6 +408,21 @@
     <w:p>
       <w:r>
         <w:rPr>
+          <w:sz w:val="20"/>
+        </w:rPr>
+      </w:r>
+    </w:p>
+    <w:p>
+      <w:r>
+        <w:rPr>
+          <w:sz w:val="20"/>
+        </w:rPr>
+        <w:t>✅ Дополнительно: освобождение от НДС — особенно актуально для компаний на УСН с выручкой &gt; 20 млн руб.</w:t>
+      </w:r>
+    </w:p>
+    <w:p>
+      <w:r>
+        <w:rPr>
           <w:b/>
           <w:color w:val="2D2D2D"/>
           <w:sz w:val="22"/>
@@ -474,7 +489,7 @@
                 <w:color w:val="FFFFFF"/>
                 <w:sz w:val="18"/>
               </w:rPr>
-              <w:t>До (ОСН)</w:t>
+              <w:t>До (ОСН/УСН)</w:t>
             </w:r>
           </w:p>
         </w:tc>
@@ -522,7 +537,7 @@
               <w:rPr>
                 <w:sz w:val="18"/>
               </w:rPr>
-              <w:t>Налог на прибыль</w:t>
+              <w:t>Налог на прибыль / УСН</w:t>
             </w:r>
           </w:p>
         </w:tc>
@@ -536,7 +551,7 @@
               <w:rPr>
                 <w:sz w:val="18"/>
               </w:rPr>
-              <w:t>484 000 руб.</w:t>
+              <w:t>≈ 96 800 руб.</w:t>
             </w:r>
           </w:p>
         </w:tc>
@@ -592,7 +607,7 @@
               <w:rPr>
                 <w:sz w:val="18"/>
               </w:rPr>
-              <w:t>180 000 руб.</w:t>
+              <w:t>1 000 000 руб.</w:t>
             </w:r>
           </w:p>
         </w:tc>
@@ -605,7 +620,7 @@
               <w:rPr>
                 <w:sz w:val="18"/>
               </w:rPr>
-              <w:t>90 000 руб.</w:t>
+              <w:t>500 000 руб.</w:t>
             </w:r>
           </w:p>
         </w:tc>
@@ -618,7 +633,7 @@
               <w:rPr>
                 <w:sz w:val="18"/>
               </w:rPr>
-              <w:t>90 000 руб.</w:t>
+              <w:t>500 000 руб.</w:t>
             </w:r>
           </w:p>
         </w:tc>
@@ -648,7 +663,7 @@
               <w:rPr>
                 <w:sz w:val="18"/>
               </w:rPr>
-              <w:t>≈ 100 000 руб. (оценка)</w:t>
+              <w:t>≈ 80 000 руб. (оценка)</w:t>
             </w:r>
           </w:p>
         </w:tc>
@@ -676,7 +691,7 @@
               <w:rPr>
                 <w:sz w:val="18"/>
               </w:rPr>
-              <w:t>≈ 100 000 руб.</w:t>
+              <w:t>≈ 80 000 руб.</w:t>
             </w:r>
           </w:p>
         </w:tc>
@@ -728,7 +743,7 @@
               <w:rPr>
                 <w:sz w:val="18"/>
               </w:rPr>
-              <w:t>286 800 руб.</w:t>
+              <w:t>600 000 руб.</w:t>
             </w:r>
           </w:p>
         </w:tc>
@@ -746,7 +761,30 @@
         <w:rPr>
           <w:sz w:val="20"/>
         </w:rPr>
-        <w:t>Прогноз экономии за 10 лет: 0–0 млн руб.</w:t>
+        <w:t>📌 Дополнительная экономия по НДС:</w:t>
+      </w:r>
+    </w:p>
+    <w:p>
+      <w:r>
+        <w:rPr>
+          <w:sz w:val="20"/>
+        </w:rPr>
+        <w:t>Дополнительно: компания на АУСН с выручкой свыше 20 млн руб./год обязана уплачивать НДС. Статус резидента Сколково освобождает от НДС, что даёт дополнительную экономию ориентировочно 3–5 млн руб. за 10 лет.</w:t>
+      </w:r>
+    </w:p>
+    <w:p>
+      <w:r>
+        <w:rPr>
+          <w:sz w:val="20"/>
+        </w:rPr>
+      </w:r>
+    </w:p>
+    <w:p>
+      <w:r>
+        <w:rPr>
+          <w:sz w:val="20"/>
+        </w:rPr>
+        <w:t>Прогноз минимальной экономии за 10 лет: 6 млн руб.</w:t>
       </w:r>
     </w:p>
     <w:p>
@@ -872,7 +910,7 @@
               <w:rPr>
                 <w:sz w:val="18"/>
               </w:rPr>
-              <w:t>Сотрудники &gt; 5 чел.</w:t>
+              <w:t>Сотрудники</w:t>
             </w:r>
           </w:p>
         </w:tc>
@@ -886,7 +924,7 @@
               <w:rPr>
                 <w:sz w:val="18"/>
               </w:rPr>
-              <w:t>🔴 Нет</w:t>
+              <w:t>🟢 Да</w:t>
             </w:r>
           </w:p>
         </w:tc>
@@ -1213,61 +1251,6 @@
           <w:sz w:val="20"/>
         </w:rPr>
         <w:t>7. Ежегодная экономия на налогах</w:t>
-      </w:r>
-    </w:p>
-    <w:p>
-      <w:r>
-        <w:rPr>
-          <w:b/>
-          <w:color w:val="2D2D2D"/>
-          <w:sz w:val="22"/>
-        </w:rPr>
-        <w:t>7. Что получает компания</w:t>
-      </w:r>
-    </w:p>
-    <w:p>
-      <w:r>
-        <w:rPr>
-          <w:sz w:val="20"/>
-        </w:rPr>
-        <w:t>✅ Статус резидента Фонда «Сколково»</w:t>
-        <w:br/>
-        <w:t>✅ Налоговую экономию</w:t>
-        <w:br/>
-        <w:t>✅ Патент на полезную модель</w:t>
-        <w:br/>
-        <w:t>✅ Юридическое сопровождение</w:t>
-      </w:r>
-    </w:p>
-    <w:p>
-      <w:r>
-        <w:rPr>
-          <w:sz w:val="20"/>
-        </w:rPr>
-      </w:r>
-    </w:p>
-    <w:p>
-      <w:r>
-        <w:rPr>
-          <w:sz w:val="20"/>
-        </w:rPr>
-        <w:t>С уважением,</w:t>
-      </w:r>
-    </w:p>
-    <w:p>
-      <w:r>
-        <w:rPr>
-          <w:sz w:val="20"/>
-        </w:rPr>
-        <w:t>Консалтинговая компания Andromeda Consult</w:t>
-      </w:r>
-    </w:p>
-    <w:p>
-      <w:r>
-        <w:rPr>
-          <w:sz w:val="20"/>
-        </w:rPr>
-        <w:t>info@andromedaconsult.ru | andromedaconsult.ru</w:t>
       </w:r>
     </w:p>
     <w:sectPr>

</xml_diff>